<commit_message>
docs: add architecture & admin guide to the permanent deliverable set; refresh both
- Руководство_администратора: fixed stale facts — migrations V1→V11, 47 app-data tables with
  the full V1–V11 list, and added the POST /api/integrations/jira/sync endpoint.
- Архитектура_приложения: regenerated (49-table catalog incl. V11, v1.44).
- scripts/deliverables/README.md: both docs now part of the standard update cycle
  (architecture = auto via build_architecture_doc.py; admin guide = manual review of
  migrations/table-count/REST API). Both live in the repo root (not served in Support).

Co-Authored-By: Claude Opus 4.8 <noreply@anthropic.com>
</commit_message>
<xml_diff>
--- a/Руководство_администратора_Планирование_спринта_PRO.docx
+++ b/Руководство_администратора_Планирование_спринта_PRO.docx
@@ -342,7 +342,7 @@
     </w:p>
     <w:p>
       <w:r>
-        <w:t>При старте backend Flyway автоматически применяет схему и демонстрационные данные к основной БД (миграции V1, V2, V3). Параметры задаются переменными окружения (см. «Справочник конфигурации»).</w:t>
+        <w:t>При старте backend Flyway автоматически применяет схему и демонстрационные данные к основной БД (миграции V1…V11). Параметры задаются переменными окружения (см. «Справочник конфигурации»).</w:t>
       </w:r>
     </w:p>
     <w:p>
@@ -1095,7 +1095,7 @@
     </w:p>
     <w:p>
       <w:r>
-        <w:t>Основная БД planirovanie состоит из 31 таблицы данных приложения плюс таблиц авторизации; журнал вынесен в отдельную БД planirovanie_audit. Схема создаётся и заполняется миграциями Flyway: V1 — данные и сид, V2 — авторизация, V3 — поля задачи release_id/priority/dor и таблица Kanban-досок boards, V4 — таблица board_doc (хранение доски-холста), V5 — таблица skills (компетенции Star Map), V6 — таблица agile_maturity (уровень Agile-зрелости), V7 — поле team.scrum (доп. роль «Скрам-мастер»).</w:t>
+        <w:t>Основная БД planirovanie состоит из 47 таблиц данных приложения плюс таблиц авторизации (app_users, app_sessions); журнал вынесен в отдельную БД planirovanie_audit. Схема создаётся и заполняется миграциями Flyway V1…V11: V1 — данные и сид, V2 — авторизация, V3 — поля задачи (release_id/priority/dor) и Kanban-доски (boards), V4 — доска-холст (board_doc), V5 — компетенции (skills), V6 — Agile-зрелость (agile_maturity), V7 — роль «Скрам-мастер» (team.scrum), V8 — цели спринтов и WSJF (sprint_goals, wsjf), V9 — WIP-лимиты, чеклист DoR (dor_items), scope-лог (scope_log), связь с OKR и счётчик переносов у задач, V10 — пакеты управления проектом (change_requests, issues, stakeholders, decisions, impediments, lessons, raci, story_map, poker, portfolio) и иерархия работ (tasks.parent), V11 — Team Health Check (team_health), деплои (deployments) и инциденты (incidents) для DORA.</w:t>
       </w:r>
     </w:p>
     <w:p>
@@ -3239,6 +3239,38 @@
           <w:p>
             <w:r>
               <w:t>WebSocket живой совместной работы над доской (курсоры + операции).</w:t>
+            </w:r>
+          </w:p>
+        </w:tc>
+      </w:tr>
+      <w:tr>
+        <w:tc>
+          <w:tcPr>
+            <w:tcW w:type="dxa" w:w="2880"/>
+          </w:tcPr>
+          <w:p>
+            <w:r>
+              <w:t>POST /api/integrations/jira/sync</w:t>
+            </w:r>
+          </w:p>
+        </w:tc>
+        <w:tc>
+          <w:tcPr>
+            <w:tcW w:type="dxa" w:w="2880"/>
+          </w:tcPr>
+          <w:p>
+            <w:r>
+              <w:t>EDITOR/ADMIN</w:t>
+            </w:r>
+          </w:p>
+        </w:tc>
+        <w:tc>
+          <w:tcPr>
+            <w:tcW w:type="dxa" w:w="2880"/>
+          </w:tcPr>
+          <w:p>
+            <w:r>
+              <w:t>Двусторонняя синхронизация: получение статусов задач из проекта Jira.</w:t>
             </w:r>
           </w:p>
         </w:tc>

</xml_diff>